<commit_message>
docs: figure placement, A4 docx and small corrections in the stage 1 report
</commit_message>
<xml_diff>
--- a/docs/reports/stage1-uml.docx
+++ b/docs/reports/stage1-uml.docx
@@ -1523,31 +1523,31 @@
         <w:rPr>
           <w:lang w:val="uk"/>
         </w:rPr>
-        <w:t xml:space="preserve">простір і не може впливати на чужі дані. База даних і об’єктне сховище — внутрішні</w:t>
-      </w:r>
-      <w:r>
-        <w:rPr>
-          <w:lang w:val="uk"/>
-        </w:rPr>
-        <w:t xml:space="preserve"> </w:t>
-      </w:r>
-      <w:r>
-        <w:rPr>
-          <w:lang w:val="uk"/>
-        </w:rPr>
-        <w:t xml:space="preserve">компоненти системи, а не зовнішні актори: вони не мають власних цілей</w:t>
-      </w:r>
-      <w:r>
-        <w:rPr>
-          <w:lang w:val="uk"/>
-        </w:rPr>
-        <w:t xml:space="preserve"> </w:t>
-      </w:r>
-      <w:r>
-        <w:rPr>
-          <w:lang w:val="uk"/>
-        </w:rPr>
-        <w:t xml:space="preserve">у системі: до них звертаються лише серверні модулі.</w:t>
+        <w:t xml:space="preserve">простір і не може впливати на чужі дані. База даних і об’єктне сховище є</w:t>
+      </w:r>
+      <w:r>
+        <w:rPr>
+          <w:lang w:val="uk"/>
+        </w:rPr>
+        <w:t xml:space="preserve"> </w:t>
+      </w:r>
+      <w:r>
+        <w:rPr>
+          <w:lang w:val="uk"/>
+        </w:rPr>
+        <w:t xml:space="preserve">внутрішніми компонентами системи, а не зовнішніми акторами. Вони не мають власних</w:t>
+      </w:r>
+      <w:r>
+        <w:rPr>
+          <w:lang w:val="uk"/>
+        </w:rPr>
+        <w:t xml:space="preserve"> </w:t>
+      </w:r>
+      <w:r>
+        <w:rPr>
+          <w:lang w:val="uk"/>
+        </w:rPr>
+        <w:t xml:space="preserve">цілей у системі: до них звертаються лише серверні модулі.</w:t>
       </w:r>
     </w:p>
     <w:bookmarkEnd w:id="10"/>
@@ -5370,6 +5370,25 @@
               </w:rPr>
               <w:t xml:space="preserve">Content-Type</w:t>
             </w:r>
+            <w:r>
+              <w:rPr>
+                <w:lang w:val="uk"/>
+              </w:rPr>
+              <w:t xml:space="preserve">,</w:t>
+            </w:r>
+            <w:r>
+              <w:rPr>
+                <w:lang w:val="uk"/>
+              </w:rPr>
+              <w:t xml:space="preserve"> </w:t>
+            </w:r>
+            <w:r>
+              <w:rPr>
+                <w:rStyle w:val="VerbatimChar"/>
+                <w:lang w:val="uk"/>
+              </w:rPr>
+              <w:t xml:space="preserve">Content-Disposition</w:t>
+            </w:r>
           </w:p>
         </w:tc>
       </w:tr>
@@ -5665,55 +5684,67 @@
         <w:rPr>
           <w:lang w:val="uk"/>
         </w:rPr>
-        <w:t xml:space="preserve">«FileListOperations», модулем перегляду, «SyncEngine» і «FileApiClient»; стрілка</w:t>
-      </w:r>
-      <w:r>
-        <w:rPr>
-          <w:lang w:val="uk"/>
-        </w:rPr>
-        <w:t xml:space="preserve"> </w:t>
-      </w:r>
-      <w:r>
-        <w:rPr>
-          <w:lang w:val="uk"/>
-        </w:rPr>
-        <w:t xml:space="preserve">«import» між ними показує, що вся логіка списку й синхронізації зосереджена в</w:t>
-      </w:r>
-      <w:r>
-        <w:rPr>
-          <w:lang w:val="uk"/>
-        </w:rPr>
-        <w:t xml:space="preserve"> </w:t>
-      </w:r>
-      <w:r>
-        <w:rPr>
-          <w:lang w:val="uk"/>
-        </w:rPr>
-        <w:t xml:space="preserve">одному місці. Десктопний клієнт складається з компонентів «Main process»</w:t>
-      </w:r>
-      <w:r>
-        <w:rPr>
-          <w:lang w:val="uk"/>
-        </w:rPr>
-        <w:t xml:space="preserve"> </w:t>
-      </w:r>
-      <w:r>
-        <w:rPr>
-          <w:lang w:val="uk"/>
-        </w:rPr>
-        <w:t xml:space="preserve">(«NodeLocalFolder», «FolderWatcher», «JsonSnapshotStore», «DragOutHandler»),</w:t>
-      </w:r>
-      <w:r>
-        <w:rPr>
-          <w:lang w:val="uk"/>
-        </w:rPr>
-        <w:t xml:space="preserve"> </w:t>
-      </w:r>
-      <w:r>
-        <w:rPr>
-          <w:lang w:val="uk"/>
-        </w:rPr>
-        <w:t xml:space="preserve">«Preload bridge (IPC)» і «Renderer (React screens)», з’єднаних лінією</w:t>
+        <w:t xml:space="preserve">«FileListOperations», модулем перегляду, «SyncEngine», «SnapshotStore» і</w:t>
+      </w:r>
+      <w:r>
+        <w:rPr>
+          <w:lang w:val="uk"/>
+        </w:rPr>
+        <w:t xml:space="preserve"> </w:t>
+      </w:r>
+      <w:r>
+        <w:rPr>
+          <w:lang w:val="uk"/>
+        </w:rPr>
+        <w:t xml:space="preserve">«FileApiClient»; стрілка «import» між ними показує, що вся логіка списку й</w:t>
+      </w:r>
+      <w:r>
+        <w:rPr>
+          <w:lang w:val="uk"/>
+        </w:rPr>
+        <w:t xml:space="preserve"> </w:t>
+      </w:r>
+      <w:r>
+        <w:rPr>
+          <w:lang w:val="uk"/>
+        </w:rPr>
+        <w:t xml:space="preserve">синхронізації зосереджена в одному місці. Десктопний клієнт складається з</w:t>
+      </w:r>
+      <w:r>
+        <w:rPr>
+          <w:lang w:val="uk"/>
+        </w:rPr>
+        <w:t xml:space="preserve"> </w:t>
+      </w:r>
+      <w:r>
+        <w:rPr>
+          <w:lang w:val="uk"/>
+        </w:rPr>
+        <w:t xml:space="preserve">компонентів «Main process» («NodeLocalFolder», «FolderWatcher», «JsonSnapshotStore»,</w:t>
+      </w:r>
+      <w:r>
+        <w:rPr>
+          <w:lang w:val="uk"/>
+        </w:rPr>
+        <w:t xml:space="preserve"> </w:t>
+      </w:r>
+      <w:r>
+        <w:rPr>
+          <w:lang w:val="uk"/>
+        </w:rPr>
+        <w:t xml:space="preserve">«DragOutHandler»), «Preload bridge (IPC)» і «Renderer (React screens,</w:t>
+      </w:r>
+      <w:r>
+        <w:rPr>
+          <w:lang w:val="uk"/>
+        </w:rPr>
+        <w:t xml:space="preserve"> </w:t>
+      </w:r>
+      <w:r>
+        <w:rPr>
+          <w:lang w:val="uk"/>
+        </w:rPr>
+        <w:t xml:space="preserve">FileListController)», з’єднаних лінією</w:t>
       </w:r>
       <w:r>
         <w:rPr>
@@ -5749,19 +5780,80 @@
         <w:rPr>
           <w:lang w:val="uk"/>
         </w:rPr>
-        <w:t xml:space="preserve">«Pages (/login, /register, /workspace)» і «BrowserLocalFolder,</w:t>
-      </w:r>
-      <w:r>
-        <w:rPr>
-          <w:lang w:val="uk"/>
-        </w:rPr>
-        <w:t xml:space="preserve"> </w:t>
-      </w:r>
-      <w:r>
-        <w:rPr>
-          <w:lang w:val="uk"/>
-        </w:rPr>
-        <w:t xml:space="preserve">IndexedDbSnapshotStore». Обидва клієнти імпортують спільні пакети і споживають</w:t>
+        <w:t xml:space="preserve">«Pages (/login, /register, /workspace) + FileListController» і «BrowserLocalFolder,</w:t>
+      </w:r>
+      <w:r>
+        <w:rPr>
+          <w:lang w:val="uk"/>
+        </w:rPr>
+        <w:t xml:space="preserve"> </w:t>
+      </w:r>
+      <w:r>
+        <w:rPr>
+          <w:lang w:val="uk"/>
+        </w:rPr>
+        <w:t xml:space="preserve">IndexedDbSnapshotStore»: керувальний клас «FileListController» власного компонента</w:t>
+      </w:r>
+      <w:r>
+        <w:rPr>
+          <w:lang w:val="uk"/>
+        </w:rPr>
+        <w:t xml:space="preserve"> </w:t>
+      </w:r>
+      <w:r>
+        <w:rPr>
+          <w:lang w:val="uk"/>
+        </w:rPr>
+        <w:t xml:space="preserve">не має, а живе в рендерері десктопа і на сторінках веб-клієнта, тоді як інтерфейс</w:t>
+      </w:r>
+      <w:r>
+        <w:rPr>
+          <w:lang w:val="uk"/>
+        </w:rPr>
+        <w:t xml:space="preserve"> </w:t>
+      </w:r>
+      <w:r>
+        <w:rPr>
+          <w:lang w:val="uk"/>
+        </w:rPr>
+        <w:t xml:space="preserve">сховища знімка «SnapshotStore» оголошено в</w:t>
+      </w:r>
+      <w:r>
+        <w:rPr>
+          <w:lang w:val="uk"/>
+        </w:rPr>
+        <w:t xml:space="preserve"> </w:t>
+      </w:r>
+      <w:r>
+        <w:rPr>
+          <w:rStyle w:val="VerbatimChar"/>
+          <w:lang w:val="uk"/>
+        </w:rPr>
+        <w:t xml:space="preserve">@shelf/shared</w:t>
+      </w:r>
+      <w:r>
+        <w:rPr>
+          <w:lang w:val="uk"/>
+        </w:rPr>
+        <w:t xml:space="preserve"> </w:t>
+      </w:r>
+      <w:r>
+        <w:rPr>
+          <w:lang w:val="uk"/>
+        </w:rPr>
+        <w:t xml:space="preserve">і реалізовано в обох</w:t>
+      </w:r>
+      <w:r>
+        <w:rPr>
+          <w:lang w:val="uk"/>
+        </w:rPr>
+        <w:t xml:space="preserve"> </w:t>
+      </w:r>
+      <w:r>
+        <w:rPr>
+          <w:lang w:val="uk"/>
+        </w:rPr>
+        <w:t xml:space="preserve">клієнтах. Обидва клієнти імпортують спільні пакети і споживають</w:t>
       </w:r>
       <w:r>
         <w:rPr>
@@ -11578,6 +11670,8 @@
       <w:footnotePr>
         <w:numRestart w:val="eachSect"/>
       </w:footnotePr>
+      <w:pgSz w:w="11906" w:h="16838"/>
+      <w:pgMar w:top="1134" w:right="1134" w:bottom="1134" w:left="1134" w:header="708" w:footer="708" w:gutter="0"/>
     </w:sectPr>
   </w:body>
 </w:document>

</xml_diff>